<commit_message>
report: add three ATB progress slides to 1023 deck
Page 1 fills MPI-label invariance vs CoC response (B36, 10-21 record);
pages 2-3 reserve slots for CoC-VAE fine-structure and B36 full-25 runs.
Speech gains matching sections; FlashReFocus pages renumbered to 4-5.

Co-Authored-By: Claude Opus 5.5 (1M context) <noreply@anthropic.com>
</commit_message>
<xml_diff>
--- a/汇报/2026-10-23_ATB进展与FlashReFocus/FlashReFocus_论文介绍_1023_讲稿.docx
+++ b/汇报/2026-10-23_ATB进展与FlashReFocus/FlashReFocus_论文介绍_1023_讲稿.docx
@@ -7,12 +7,12 @@
         <w:pStyle w:val="Title"/>
       </w:pPr>
       <w:r>
-        <w:t>10.23 汇报讲稿｜FlashReFocus 论文介绍</w:t>
+        <w:t>10.23 汇报讲稿｜ATB 进展与 FlashReFocus 论文介绍</w:t>
       </w:r>
     </w:p>
     <w:p>
       <w:r>
-        <w:t>本部分共两页，用于接入本周汇报的第二部分。图像来自论文公开结果，尚无本地复现成绩。</w:t>
+        <w:t>本次共五页：第 1–3 页是 ATB 失败分析进展，第 4–5 页介绍 FlashReFocus。FlashReFocus 图像来自论文公开结果，尚无本地复现成绩。</w:t>
       </w:r>
     </w:p>
     <w:p>
@@ -20,7 +20,76 @@
         <w:pStyle w:val="Heading1"/>
       </w:pPr>
       <w:r>
-        <w:t>第 1 页｜FlashReFocus：单张照片的交互式重对焦</w:t>
+        <w:t>第 1 页｜ATB 条件核验：几何只经离焦图起作用</w:t>
+      </w:r>
+    </w:p>
+    <w:p>
+      <w:r>
+        <w:t>ATB 会把视差和焦点转换成两路几何条件：一路是离焦图（CoC，每个位置离焦平面有多远），另一路是 MPI 分区标签（把画面按深度分成几层）。上次鸭头局部修正时两路同时改变，没法判断是哪一路起作用，所以这次在鸭头视频上分开测。</w:t>
+      </w:r>
+    </w:p>
+    <w:p>
+      <w:r>
+        <w:t>做法：mallard-water 完整 25 帧、K=16，权重、RGB、焦点和随机状态全部固定，按原生 8/8/9 窗口推理。表中四个条件分别是：原版重复一次；把传入 UNet 的分区标签全部改成 0；全部改成 3；分区标签不动，只把第 0 帧鸭头的离焦图换成“鸭头取颈部视差”后的版本。</w:t>
+      </w:r>
+    </w:p>
+    <w:p>
+      <w:r>
+        <w:t>结果：前三组与原版的 float 输出逐位相同，RGB 字节差为 0，说明分区标签没有影响输出。原因是公开版代码（提交 f7a16959）在 UNet 内把分区 mask 置零了。只改离焦图的一组有 1,246,773 个字节发生变化，范围是第 0–7 帧（同一窗口），第 8 帧以后不变；右侧三张图是第 0 帧鸭头局部，修正后头部纹理更接近原图。</w:t>
+      </w:r>
+    </w:p>
+    <w:p>
+      <w:r>
+        <w:t>结论口径：在这个公开版本和这段测试输入上，几何信息只通过离焦图进入模型。这不等于“作者没有用任何 mask”：主体 mask 仍用来算焦点，注意力里对附加 RGB token 的屏蔽也仍在执行；也不能推断作者论文实验或私有训练版本的情况。这里的响应量只表示模型对条件有反应，不是质量分数。</w:t>
+      </w:r>
+    </w:p>
+    <w:p>
+      <w:r>
+        <w:t>证据：03_实验记录/records/any2bokeh-B36-MPI-invariance-20261021.json。</w:t>
+      </w:r>
+    </w:p>
+    <w:p>
+      <w:pPr>
+        <w:pStyle w:val="Heading1"/>
+      </w:pPr>
+      <w:r>
+        <w:t>第 2 页｜离焦图经 VAE 压缩后，细结构还剩多少（待实验）</w:t>
+      </w:r>
+    </w:p>
+    <w:p>
+      <w:r>
+        <w:t>动机：离焦图要先经过 VAE 编码，从 576×1024 压缩到 72×128，相当于每 8×8 像素合成一个特征点。细绳只有 1–3 像素宽，修正信号可能在这一步就被大幅削弱。这可以解释为什么栏杆细绳（B33）的窄带修正几乎没有效果，而大块的鸭头修正有效。</w:t>
+      </w:r>
+    </w:p>
+    <w:p>
+      <w:r>
+        <w:t>计划：用 1–32 像素宽的合成直线测“线宽–响应”曲线，再看细绳和鸭头两个真实修正在特征层的差异。结果出来后补图和结论；这一步只测编码层，不能单独证明 UNet 无法响应。</w:t>
+      </w:r>
+    </w:p>
+    <w:p>
+      <w:pPr>
+        <w:pStyle w:val="Heading1"/>
+      </w:pPr>
+      <w:r>
+        <w:t>第 3 页｜鸭头全 25 帧局部修正（待实验）</w:t>
+      </w:r>
+    </w:p>
+    <w:p>
+      <w:r>
+        <w:t>动机：目前只验证了第 0 帧。这一步把鸭头修正扩展到全部 25 帧：逐帧跟踪头部和颈部，用当帧颈部视差作参考，只改离焦图，其余条件固定；另设“同样改动平移到水面”的对照。</w:t>
+      </w:r>
+    </w:p>
+    <w:p>
+      <w:r>
+        <w:t>计划展示：第 0/8/16/24 帧的原图、原版、修正后头部对比，以及头部清晰度、对周围区域的影响和时序稳定性三项指标。颈部参考值是诊断用的修正值，不是测得的真实深度。</w:t>
+      </w:r>
+    </w:p>
+    <w:p>
+      <w:pPr>
+        <w:pStyle w:val="Heading1"/>
+      </w:pPr>
+      <w:r>
+        <w:t>第 4 页｜FlashReFocus：单张照片的交互式重对焦</w:t>
       </w:r>
     </w:p>
     <w:p>
@@ -63,7 +132,7 @@
         <w:pStyle w:val="Heading1"/>
       </w:pPr>
       <w:r>
-        <w:t>第 2 页｜方法原理：先恢复清晰，再按深度渲染</w:t>
+        <w:t>第 5 页｜方法原理：先恢复清晰，再按深度渲染</w:t>
       </w:r>
     </w:p>
     <w:p>

</xml_diff>

<commit_message>
report: shorten ATB slide titles in 1023 deck
Titles now state each page's finding or question directly; speech headings match.

Co-Authored-By: Claude Opus 5.5 (1M context) <noreply@anthropic.com>
</commit_message>
<xml_diff>
--- a/汇报/2026-10-23_ATB进展与FlashReFocus/FlashReFocus_论文介绍_1023_讲稿.docx
+++ b/汇报/2026-10-23_ATB进展与FlashReFocus/FlashReFocus_论文介绍_1023_讲稿.docx
@@ -20,7 +20,7 @@
         <w:pStyle w:val="Heading1"/>
       </w:pPr>
       <w:r>
-        <w:t>第 1 页｜ATB 条件核验：几何只经离焦图起作用</w:t>
+        <w:t>第 1 页｜几何条件只经离焦图生效</w:t>
       </w:r>
     </w:p>
     <w:p>
@@ -53,7 +53,7 @@
         <w:pStyle w:val="Heading1"/>
       </w:pPr>
       <w:r>
-        <w:t>第 2 页｜离焦图经 VAE 压缩后，细结构还剩多少（待实验）</w:t>
+        <w:t>第 2 页｜VAE 编码可能削弱细结构修正（待实验）</w:t>
       </w:r>
     </w:p>
     <w:p>
@@ -71,7 +71,7 @@
         <w:pStyle w:val="Heading1"/>
       </w:pPr>
       <w:r>
-        <w:t>第 3 页｜鸭头全 25 帧局部修正（待实验）</w:t>
+        <w:t>第 3 页｜鸭头修正扩展到全部 25 帧（待实验）</w:t>
       </w:r>
     </w:p>
     <w:p>

</xml_diff>

<commit_message>
report: replace ATB pages in 1023 deck with 4-page Ours plan
Recap (B36 head A vs R2), corrector pipeline, Sintel RGB/GT/VDA panels,
4-step plan. Adds the Sintel pilot VDA script used for the panels.

Co-Authored-By: Claude Opus 5.5 (1M context) <noreply@anthropic.com>
</commit_message>
<xml_diff>
--- a/汇报/2026-10-23_ATB进展与FlashReFocus/FlashReFocus_论文介绍_1023_讲稿.docx
+++ b/汇报/2026-10-23_ATB进展与FlashReFocus/FlashReFocus_论文介绍_1023_讲稿.docx
@@ -7,12 +7,12 @@
         <w:pStyle w:val="Title"/>
       </w:pPr>
       <w:r>
-        <w:t>10.23 汇报讲稿｜ATB 进展与 FlashReFocus 论文介绍</w:t>
+        <w:t>10.23 汇报讲稿｜ATB 下一步计划与 FlashReFocus 论文介绍</w:t>
       </w:r>
     </w:p>
     <w:p>
       <w:r>
-        <w:t>本次共五页：第 1–3 页是 ATB 失败分析进展，第 4–5 页介绍 FlashReFocus。FlashReFocus 图像来自论文公开结果，尚无本地复现成绩。</w:t>
+        <w:t>本次共六页：第 1–4 页是 ATB 方向的下一步计划，第 5–6 页介绍 FlashReFocus。FlashReFocus 图像来自论文公开结果，尚无本地复现成绩。</w:t>
       </w:r>
     </w:p>
     <w:p>
@@ -20,32 +20,22 @@
         <w:pStyle w:val="Heading1"/>
       </w:pPr>
       <w:r>
-        <w:t>第 1 页｜几何条件只经离焦图生效</w:t>
+        <w:t>第 1 页｜修正离焦图后鸭头变清晰（回顾）</w:t>
       </w:r>
     </w:p>
     <w:p>
       <w:r>
-        <w:t>ATB 会把视差和焦点转换成两路几何条件：一路是离焦图（CoC，每个位置离焦平面有多远），另一路是 MPI 分区标签（把画面按深度分成几层）。上次鸭头局部修正时两路同时改变，没法判断是哪一路起作用，所以这次在鸭头视频上分开测。</w:t>
+        <w:t>这一页回顾上次的结论，作为本次计划的出发点。mallard-water 中焦点对在鸭子上，但 ATB 原版输出的鸭头偏模糊（上排）。我们只改送进 ATB 的离焦图，让鸭头取接近颈部的视差，其余输入、权重和随机状态都不变，25 帧鸭头全程变清晰（下排）。</w:t>
       </w:r>
     </w:p>
     <w:p>
       <w:r>
-        <w:t>做法：mallard-water 完整 25 帧、K=16，权重、RGB、焦点和随机状态全部固定，按原生 8/8/9 窗口推理。表中四个条件分别是：原版重复一次；把传入 UNet 的分区标签全部改成 0；全部改成 3；分区标签不动，只把第 0 帧鸭头的离焦图换成“鸭头取颈部视差”后的版本。</w:t>
+        <w:t>图中是第 0/8/16/24 帧的鸭头局部放大。这里的修正值来自颈部参考和人工确认的头部区域，属于诊断用的修正，不是自动方法，也不是测得的真实深度。它说明的是：深度条件出错会直接造成主体误虚化，修正条件后 ATB 能把主体还原清楚。这就是本次计划要自动化的部分。</w:t>
       </w:r>
     </w:p>
     <w:p>
       <w:r>
-        <w:t>结果：前三组与原版的 float 输出逐位相同，RGB 字节差为 0，说明分区标签没有影响输出。原因是公开版代码（提交 f7a16959）在 UNet 内把分区 mask 置零了。只改离焦图的一组有 1,246,773 个字节发生变化，范围是第 0–7 帧（同一窗口），第 8 帧以后不变；右侧三张图是第 0 帧鸭头局部，修正后头部纹理更接近原图。</w:t>
-      </w:r>
-    </w:p>
-    <w:p>
-      <w:r>
-        <w:t>结论口径：在这个公开版本和这段测试输入上，几何信息只通过离焦图进入模型。这不等于“作者没有用任何 mask”：主体 mask 仍用来算焦点，注意力里对附加 RGB token 的屏蔽也仍在执行；也不能推断作者论文实验或私有训练版本的情况。这里的响应量只表示模型对条件有反应，不是质量分数。</w:t>
-      </w:r>
-    </w:p>
-    <w:p>
-      <w:r>
-        <w:t>证据：03_实验记录/records/any2bokeh-B36-MPI-invariance-20261021.json。</w:t>
+        <w:t>证据：03_实验记录/records/any2bokeh-B36-rule-b-R2-20261021-user-review.json；历史阶段记录 2026-10-22_ATB局部CoC诊断与主体限幅V2阶段记录.md。</w:t>
       </w:r>
     </w:p>
     <w:p>
@@ -53,17 +43,22 @@
         <w:pStyle w:val="Heading1"/>
       </w:pPr>
       <w:r>
-        <w:t>第 2 页｜VAE 编码可能削弱细结构修正（待实验）</w:t>
+        <w:t>第 2 页｜在深度和虚化之间加修正器</w:t>
       </w:r>
     </w:p>
     <w:p>
       <w:r>
-        <w:t>动机：离焦图要先经过 VAE 编码，从 576×1024 压缩到 72×128，相当于每 8×8 像素合成一个特征点。细绳只有 1–3 像素宽，修正信号可能在这一步就被大幅削弱。这可以解释为什么栏杆细绳（B33）的窄带修正几乎没有效果，而大块的鸭头修正有效。</w:t>
+        <w:t>方案思路：深度模型 VDA 和虚化模型 ATB 都保持原样、不重新训练，只在两者之间加一个轻量修正器。修正器读入 RGB 帧和 VDA 预测的深度，输出一个深度修正量，加回原深度后再按作者原流程算离焦图送进 ATB；焦点和虚化强度不变。</w:t>
       </w:r>
     </w:p>
     <w:p>
       <w:r>
-        <w:t>计划：用 1–32 像素宽的合成直线测“线宽–响应”曲线，再看细绳和鸭头两个真实修正在特征层的差异。结果出来后补图和结论；这一步只测编码层，不能单独证明 UNet 无法响应。</w:t>
+        <w:t>训练时用数据集提供的真值深度监督修正器（虚线部分），推理时只需要 RGB 和 VDA 深度，不需要真值、人工标注或主体 mask。这样做的好处是训练成本低、改动可解释，而且原 baseline 不受影响，方便做公平对比。</w:t>
+      </w:r>
+    </w:p>
+    <w:p>
+      <w:r>
+        <w:t>目标不是把整个主体都拉成同一深度，而是只改真正估错、影响虚化的位置，保留合理的前后纵深和背景虚化。网络结构、损失权重和训练参数尚未确定。</w:t>
       </w:r>
     </w:p>
     <w:p>
@@ -71,17 +66,27 @@
         <w:pStyle w:val="Heading1"/>
       </w:pPr>
       <w:r>
-        <w:t>第 3 页｜鸭头修正扩展到全部 25 帧（待实验）</w:t>
+        <w:t>第 3 页｜用真值深度训练修正器</w:t>
       </w:r>
     </w:p>
     <w:p>
       <w:r>
-        <w:t>动机：目前只验证了第 0 帧。这一步把鸭头修正扩展到全部 25 帧：逐帧跟踪头部和颈部，用当帧颈部视差作参考，只改离焦图，其余条件固定；另设“同样改动平移到水面”的对照。</w:t>
+        <w:t>训练数据先用 MPI Sintel：它是开源动画电影渲染的视频数据集，每帧都有精确的真值深度。目前已下载 6 个场景、每个 25 帧（clean 渲染），按场景划分为 4 段训练、2 段开发，同一场景的帧不跨集合。</w:t>
       </w:r>
     </w:p>
     <w:p>
       <w:r>
-        <w:t>计划展示：第 0/8/16/24 帧的原图、原版、修正后头部对比，以及头部清晰度、对周围区域的影响和时序稳定性三项指标。颈部参考值是诊断用的修正值，不是测得的真实深度。</w:t>
+        <w:t>图中三列依次是原图、真值深度和 VDA 预测（第 12 帧）。为便于对比，VDA 输出在每段视频内用一次整体的尺度和偏移对齐到真值逆深度，两者使用相同的颜色范围。可以看到 VDA 整体结构正确，但胡须、头发等细节被抹平，部分前后层次的深度差也偏小。这些正是修正器需要学的内容。</w:t>
+      </w:r>
+    </w:p>
+    <w:p>
+      <w:r>
+        <w:t>在 6 段上，对齐后逆深度相对误差的中位数为 0.07–0.31。这只是数据可用性的初步检查：Sintel 是合成动画，不能代表全部真实视频；它也已被 VDA 等论文用作评测集，不能当作独立测试集。Spring 数据集是第二候选，官方下载入口暂时超时，尚未获取。</w:t>
+      </w:r>
+    </w:p>
+    <w:p>
+      <w:r>
+        <w:t>记录：outputs/ours-geometry-pilot-vda-20261022/summary.json（本地输出，未入 Git）；scripts/run_sintel_pilot_vda.py。</w:t>
       </w:r>
     </w:p>
     <w:p>
@@ -89,7 +94,30 @@
         <w:pStyle w:val="Heading1"/>
       </w:pPr>
       <w:r>
-        <w:t>第 4 页｜FlashReFocus：单张照片的交互式重对焦</w:t>
+        <w:t>第 4 页｜实验计划</w:t>
+      </w:r>
+    </w:p>
+    <w:p>
+      <w:r>
+        <w:t>实验分四步推进。第一步验证提升空间：同一段视频、同样的焦点和虚化强度，分别用 VDA 深度和真值深度送进 ATB，看输出能好多少。这是下一步马上要做的实验。</w:t>
+      </w:r>
+    </w:p>
+    <w:p>
+      <w:r>
+        <w:t>第二步用 Sintel 真值训练修正器，同时检查原本正确的区域不被改动。第三步与 ATB 原版、上次的主体离焦约束等简单方法对比。第四步回到 DAVIS 真实视频，看主体是否变清晰、背景虚化是否保持。</w:t>
+      </w:r>
+    </w:p>
+    <w:p>
+      <w:r>
+        <w:t>是否需要大模型教师蒸馏、真实视频上如何做无真值适配，等前两步结果出来后再决定。</w:t>
+      </w:r>
+    </w:p>
+    <w:p>
+      <w:pPr>
+        <w:pStyle w:val="Heading1"/>
+      </w:pPr>
+      <w:r>
+        <w:t>第 5 页｜FlashReFocus：单张照片的交互式重对焦</w:t>
       </w:r>
     </w:p>
     <w:p>
@@ -132,7 +160,7 @@
         <w:pStyle w:val="Heading1"/>
       </w:pPr>
       <w:r>
-        <w:t>第 5 页｜方法原理：先恢复清晰，再按深度渲染</w:t>
+        <w:t>第 6 页｜方法原理：先恢复清晰，再按深度渲染</w:t>
       </w:r>
     </w:p>
     <w:p>

</xml_diff>